<commit_message>
Updated WatchNext feature list
</commit_message>
<xml_diff>
--- a/docs/WatchNext feature list.docx
+++ b/docs/WatchNext feature list.docx
@@ -81,7 +81,7 @@
         </w:numPr>
       </w:pPr>
       <w:r>
-        <w:t xml:space="preserve">☐ Update the handover document (docs/WatchNext-Handover-v6.md) with everything built since Badges</w:t>
+        <w:t xml:space="preserve">☒ Update the handover document (docs/WatchNext-Handover-v6.md) with everything built since Badges</w:t>
       </w:r>
     </w:p>
     <w:p>
@@ -107,7 +107,7 @@
     <w:p>
       <w:pPr/>
       <w:r>
-        <w:t xml:space="preserve">Seven ideas are left; tick one off when it's built.</w:t>
+        <w:t xml:space="preserve">Five ideas are left; tick one off when it's built.</w:t>
       </w:r>
     </w:p>
     <w:tbl>
@@ -118,9 +118,9 @@
         <w:tblLook w:val="04A0" w:firstRow="1" w:lastRow="0" w:firstColumn="0" w:lastColumn="0" w:noHBand="0" w:noVBand="1"/>
       </w:tblPr>
       <w:tblGrid>
-        <w:gridCol w:w="809"/>
-        <w:gridCol w:w="3243"/>
-        <w:gridCol w:w="5307"/>
+        <w:gridCol w:w="750"/>
+        <w:gridCol w:w="3690"/>
+        <w:gridCol w:w="4920"/>
       </w:tblGrid>
       <w:tr>
         <w:trPr>
@@ -128,7 +128,7 @@
         </w:trPr>
         <w:tc>
           <w:tcPr>
-            <w:tcW w:w="809" w:type="dxa"/>
+            <w:tcW w:w="750" w:type="dxa"/>
             <w:shd w:val="clear" w:color="auto" w:fill="F2F2F2"/>
           </w:tcPr>
           <w:p>
@@ -140,7 +140,7 @@
         </w:tc>
         <w:tc>
           <w:tcPr>
-            <w:tcW w:w="3243" w:type="dxa"/>
+            <w:tcW w:w="3690" w:type="dxa"/>
             <w:shd w:val="clear" w:color="auto" w:fill="F2F2F2"/>
           </w:tcPr>
           <w:p>
@@ -152,7 +152,7 @@
         </w:tc>
         <w:tc>
           <w:tcPr>
-            <w:tcW w:w="5307" w:type="dxa"/>
+            <w:tcW w:w="4920" w:type="dxa"/>
             <w:shd w:val="clear" w:color="auto" w:fill="F2F2F2"/>
           </w:tcPr>
           <w:p>
@@ -166,7 +166,7 @@
       <w:tr>
         <w:tc>
           <w:tcPr>
-            <w:tcW w:w="809" w:type="dxa"/>
+            <w:tcW w:w="750" w:type="dxa"/>
           </w:tcPr>
           <w:p>
             <w:pPr/>
@@ -177,31 +177,31 @@
         </w:tc>
         <w:tc>
           <w:tcPr>
-            <w:tcW w:w="3243" w:type="dxa"/>
-          </w:tcPr>
-          <w:p>
-            <w:pPr/>
-            <w:r>
-              <w:t xml:space="preserve">Spoiler shield</w:t>
-            </w:r>
-          </w:p>
-        </w:tc>
-        <w:tc>
-          <w:tcPr>
-            <w:tcW w:w="5307" w:type="dxa"/>
-          </w:tcPr>
-          <w:p>
-            <w:pPr/>
-            <w:r>
-              <w:t xml:space="preserve">Hide titles, summaries and pictures of episodes you haven't watched yet</w:t>
-            </w:r>
-          </w:p>
-        </w:tc>
-      </w:tr>
-      <w:tr>
-        <w:tc>
-          <w:tcPr>
-            <w:tcW w:w="809" w:type="dxa"/>
+            <w:tcW w:w="3690" w:type="dxa"/>
+          </w:tcPr>
+          <w:p>
+            <w:pPr/>
+            <w:r>
+              <w:t xml:space="preserve">Home-screen shortcuts</w:t>
+            </w:r>
+          </w:p>
+        </w:tc>
+        <w:tc>
+          <w:tcPr>
+            <w:tcW w:w="4920" w:type="dxa"/>
+          </w:tcPr>
+          <w:p>
+            <w:pPr/>
+            <w:r>
+              <w:t xml:space="preserve">Long-press the app icon to jump to Up Next, Search or Tonight</w:t>
+            </w:r>
+          </w:p>
+        </w:tc>
+      </w:tr>
+      <w:tr>
+        <w:tc>
+          <w:tcPr>
+            <w:tcW w:w="750" w:type="dxa"/>
           </w:tcPr>
           <w:p>
             <w:pPr/>
@@ -212,31 +212,31 @@
         </w:tc>
         <w:tc>
           <w:tcPr>
-            <w:tcW w:w="3243" w:type="dxa"/>
-          </w:tcPr>
-          <w:p>
-            <w:pPr/>
-            <w:r>
-              <w:t xml:space="preserve">Calendar export</w:t>
-            </w:r>
-          </w:p>
-        </w:tc>
-        <w:tc>
-          <w:tcPr>
-            <w:tcW w:w="5307" w:type="dxa"/>
-          </w:tcPr>
-          <w:p>
-            <w:pPr/>
-            <w:r>
-              <w:t xml:space="preserve">Add upcoming episode air dates to your phone or Google calendar</w:t>
-            </w:r>
-          </w:p>
-        </w:tc>
-      </w:tr>
-      <w:tr>
-        <w:tc>
-          <w:tcPr>
-            <w:tcW w:w="809" w:type="dxa"/>
+            <w:tcW w:w="3690" w:type="dxa"/>
+          </w:tcPr>
+          <w:p>
+            <w:pPr/>
+            <w:r>
+              <w:t xml:space="preserve">Keyboard shortcuts</w:t>
+            </w:r>
+          </w:p>
+        </w:tc>
+        <w:tc>
+          <w:tcPr>
+            <w:tcW w:w="4920" w:type="dxa"/>
+          </w:tcPr>
+          <w:p>
+            <w:pPr/>
+            <w:r>
+              <w:t xml:space="preserve">On the computer: "/" to search, "1–6" to switch tabs</w:t>
+            </w:r>
+          </w:p>
+        </w:tc>
+      </w:tr>
+      <w:tr>
+        <w:tc>
+          <w:tcPr>
+            <w:tcW w:w="750" w:type="dxa"/>
           </w:tcPr>
           <w:p>
             <w:pPr/>
@@ -247,31 +247,31 @@
         </w:tc>
         <w:tc>
           <w:tcPr>
-            <w:tcW w:w="3243" w:type="dxa"/>
-          </w:tcPr>
-          <w:p>
-            <w:pPr/>
-            <w:r>
-              <w:t xml:space="preserve">Home-screen shortcuts</w:t>
-            </w:r>
-          </w:p>
-        </w:tc>
-        <w:tc>
-          <w:tcPr>
-            <w:tcW w:w="5307" w:type="dxa"/>
-          </w:tcPr>
-          <w:p>
-            <w:pPr/>
-            <w:r>
-              <w:t xml:space="preserve">Long-press the app icon to jump to Up Next, Search or Tonight</w:t>
-            </w:r>
-          </w:p>
-        </w:tc>
-      </w:tr>
-      <w:tr>
-        <w:tc>
-          <w:tcPr>
-            <w:tcW w:w="809" w:type="dxa"/>
+            <w:tcW w:w="3690" w:type="dxa"/>
+          </w:tcPr>
+          <w:p>
+            <w:pPr/>
+            <w:r>
+              <w:t xml:space="preserve">Compare with a friend</w:t>
+            </w:r>
+          </w:p>
+        </w:tc>
+        <w:tc>
+          <w:tcPr>
+            <w:tcW w:w="4920" w:type="dxa"/>
+          </w:tcPr>
+          <w:p>
+            <w:pPr/>
+            <w:r>
+              <w:t xml:space="preserve">Shows you've both watched, and what they loved that you haven't</w:t>
+            </w:r>
+          </w:p>
+        </w:tc>
+      </w:tr>
+      <w:tr>
+        <w:tc>
+          <w:tcPr>
+            <w:tcW w:w="750" w:type="dxa"/>
           </w:tcPr>
           <w:p>
             <w:pPr/>
@@ -282,31 +282,31 @@
         </w:tc>
         <w:tc>
           <w:tcPr>
-            <w:tcW w:w="3243" w:type="dxa"/>
-          </w:tcPr>
-          <w:p>
-            <w:pPr/>
-            <w:r>
-              <w:t xml:space="preserve">Keyboard shortcuts</w:t>
-            </w:r>
-          </w:p>
-        </w:tc>
-        <w:tc>
-          <w:tcPr>
-            <w:tcW w:w="5307" w:type="dxa"/>
-          </w:tcPr>
-          <w:p>
-            <w:pPr/>
-            <w:r>
-              <w:t xml:space="preserve">On the computer: "/" to search, "1–6" to switch tabs</w:t>
-            </w:r>
-          </w:p>
-        </w:tc>
-      </w:tr>
-      <w:tr>
-        <w:tc>
-          <w:tcPr>
-            <w:tcW w:w="809" w:type="dxa"/>
+            <w:tcW w:w="3690" w:type="dxa"/>
+          </w:tcPr>
+          <w:p>
+            <w:pPr/>
+            <w:r>
+              <w:t xml:space="preserve">Watch links (Netflix, Stan and others)</w:t>
+            </w:r>
+          </w:p>
+        </w:tc>
+        <w:tc>
+          <w:tcPr>
+            <w:tcW w:w="4920" w:type="dxa"/>
+          </w:tcPr>
+          <w:p>
+            <w:pPr/>
+            <w:r>
+              <w:t xml:space="preserve">Buttons like [▶ Netflix] [▶ Stan] [All options] on the show page and movie sheet, for the services the title is on in your region; your own services first. Opens the service searching for the title, and "All options" opens its JustWatch page. Free, no new key. Exact title links can come later through Watchmode if needed. Asked for by your friends.</w:t>
+            </w:r>
+          </w:p>
+        </w:tc>
+      </w:tr>
+      <w:tr>
+        <w:tc>
+          <w:tcPr>
+            <w:tcW w:w="750" w:type="dxa"/>
           </w:tcPr>
           <w:p>
             <w:pPr/>
@@ -317,93 +317,23 @@
         </w:tc>
         <w:tc>
           <w:tcPr>
-            <w:tcW w:w="3243" w:type="dxa"/>
-          </w:tcPr>
-          <w:p>
-            <w:pPr/>
-            <w:r>
-              <w:t xml:space="preserve">Compare with a friend</w:t>
-            </w:r>
-          </w:p>
-        </w:tc>
-        <w:tc>
-          <w:tcPr>
-            <w:tcW w:w="5307" w:type="dxa"/>
-          </w:tcPr>
-          <w:p>
-            <w:pPr/>
-            <w:r>
-              <w:t xml:space="preserve">Shows you've both watched, and what they loved that you haven't</w:t>
-            </w:r>
-          </w:p>
-        </w:tc>
-      </w:tr>
-      <w:tr>
-        <w:tc>
-          <w:tcPr>
-            <w:tcW w:w="809" w:type="dxa"/>
-          </w:tcPr>
-          <w:p>
-            <w:pPr/>
-            <w:r>
-              <w:t xml:space="preserve">[ ]</w:t>
-            </w:r>
-          </w:p>
-        </w:tc>
-        <w:tc>
-          <w:tcPr>
-            <w:tcW w:w="3243" w:type="dxa"/>
-          </w:tcPr>
-          <w:p>
-            <w:pPr/>
-            <w:r>
-              <w:t xml:space="preserve">Critic and audience scores</w:t>
-            </w:r>
-          </w:p>
-        </w:tc>
-        <w:tc>
-          <w:tcPr>
-            <w:tcW w:w="5307" w:type="dxa"/>
-          </w:tcPr>
-          <w:p>
-            <w:pPr/>
-            <w:r>
-              <w:t xml:space="preserve">IMDb, Rotten Tomatoes and Metacritic scores per title through OMDb</w:t>
-            </w:r>
-          </w:p>
-        </w:tc>
-      </w:tr>
-      <w:tr>
-        <w:tc>
-          <w:tcPr>
-            <w:tcW w:w="809" w:type="dxa"/>
-          </w:tcPr>
-          <w:p>
-            <w:pPr/>
-            <w:r>
-              <w:t xml:space="preserve">[ ]</w:t>
-            </w:r>
-          </w:p>
-        </w:tc>
-        <w:tc>
-          <w:tcPr>
-            <w:tcW w:w="3243" w:type="dxa"/>
-          </w:tcPr>
-          <w:p>
-            <w:pPr/>
-            <w:r>
-              <w:t xml:space="preserve">"New badge!" note</w:t>
-            </w:r>
-          </w:p>
-        </w:tc>
-        <w:tc>
-          <w:tcPr>
-            <w:tcW w:w="5307" w:type="dxa"/>
-          </w:tcPr>
-          <w:p>
-            <w:pPr/>
-            <w:r>
-              <w:t xml:space="preserve">A message when you earn a new badge level</w:t>
+            <w:tcW w:w="3690" w:type="dxa"/>
+          </w:tcPr>
+          <w:p>
+            <w:pPr/>
+            <w:r>
+              <w:t xml:space="preserve">Episode IMDb scores (later)</w:t>
+            </w:r>
+          </w:p>
+        </w:tc>
+        <w:tc>
+          <w:tcPr>
+            <w:tcW w:w="4920" w:type="dxa"/>
+          </w:tcPr>
+          <w:p>
+            <w:pPr/>
+            <w:r>
+              <w:t xml:space="preserve">IMDb score for each episode on the show page</w:t>
             </w:r>
           </w:p>
         </w:tc>
@@ -426,7 +356,7 @@
         </w:numPr>
       </w:pPr>
       <w:r>
-        <w:t xml:space="preserve">☐ Movie sheet: show the film's newest name and poster for every viewing, with a "Saved as … — use Fix match if this was a different film" line (the Amazing Spider-Man 2 issue)</w:t>
+        <w:t xml:space="preserve">☐ Build Watch links: search-link buttons plus "All options" (JustWatch). Waiting on your go-ahead</w:t>
       </w:r>
     </w:p>
     <w:p>
@@ -438,7 +368,19 @@
         </w:numPr>
       </w:pPr>
       <w:r>
-        <w:t xml:space="preserve">☐ Bring back the Stranger Things Season 4 first dates: Settings → Backup → Bring back first watch dates, with watchnext-backup-2026-10-10.json</w:t>
+        <w:t xml:space="preserve">☐ Movie sheet: show the film's newest name and poster for every viewing, with a "Saved as … — use Fix match if this was a different film" line (the Amazing Spider-Man 2 issue)</w:t>
+      </w:r>
+    </w:p>
+    <w:p>
+      <w:pPr>
+        <w:pStyle w:val="ListParagraph"/>
+        <w:numPr>
+          <w:ilvl w:val="0"/>
+          <w:numId w:val="3"/>
+        </w:numPr>
+      </w:pPr>
+      <w:r>
+        <w:t xml:space="preserve">☒ Bring back the Stranger Things Season 4 first dates: Settings → Backup → Bring back first watch dates, with watchnext-backup-2026-10-10.json</w:t>
       </w:r>
     </w:p>
     <w:p>
@@ -481,8 +423,8 @@
         <w:tblLook w:val="04A0" w:firstRow="1" w:lastRow="0" w:firstColumn="0" w:lastColumn="0" w:noHBand="0" w:noVBand="1"/>
       </w:tblPr>
       <w:tblGrid>
-        <w:gridCol w:w="5004"/>
-        <w:gridCol w:w="4355"/>
+        <w:gridCol w:w="4920"/>
+        <w:gridCol w:w="4440"/>
       </w:tblGrid>
       <w:tr>
         <w:trPr>
@@ -490,7 +432,7 @@
         </w:trPr>
         <w:tc>
           <w:tcPr>
-            <w:tcW w:w="5004" w:type="dxa"/>
+            <w:tcW w:w="4920" w:type="dxa"/>
             <w:shd w:val="clear" w:color="auto" w:fill="F2F2F2"/>
           </w:tcPr>
           <w:p>
@@ -502,7 +444,7 @@
         </w:tc>
         <w:tc>
           <w:tcPr>
-            <w:tcW w:w="4355" w:type="dxa"/>
+            <w:tcW w:w="4440" w:type="dxa"/>
             <w:shd w:val="clear" w:color="auto" w:fill="F2F2F2"/>
           </w:tcPr>
           <w:p>
@@ -516,7 +458,103 @@
       <w:tr>
         <w:tc>
           <w:tcPr>
-            <w:tcW w:w="5004" w:type="dxa"/>
+            <w:tcW w:w="4920" w:type="dxa"/>
+          </w:tcPr>
+          <w:p>
+            <w:pPr/>
+            <w:r>
+              <w:t xml:space="preserve">Calendar export: upcoming episodes as an .ics file (only new ones next time)</w:t>
+            </w:r>
+          </w:p>
+        </w:tc>
+        <w:tc>
+          <w:tcPr>
+            <w:tcW w:w="4440" w:type="dxa"/>
+          </w:tcPr>
+          <w:p>
+            <w:pPr/>
+            <w:r>
+              <w:t xml:space="preserve">Up Next → On the way → calendar button</w:t>
+            </w:r>
+          </w:p>
+        </w:tc>
+      </w:tr>
+      <w:tr>
+        <w:tc>
+          <w:tcPr>
+            <w:tcW w:w="4920" w:type="dxa"/>
+          </w:tcPr>
+          <w:p>
+            <w:pPr/>
+            <w:r>
+              <w:t xml:space="preserve">Spoiler shield: unwatched episode titles and summaries hidden, with Show anyway</w:t>
+            </w:r>
+          </w:p>
+        </w:tc>
+        <w:tc>
+          <w:tcPr>
+            <w:tcW w:w="4440" w:type="dxa"/>
+          </w:tcPr>
+          <w:p>
+            <w:pPr/>
+            <w:r>
+              <w:t xml:space="preserve">Settings → Spoiler shield (each device)</w:t>
+            </w:r>
+          </w:p>
+        </w:tc>
+      </w:tr>
+      <w:tr>
+        <w:tc>
+          <w:tcPr>
+            <w:tcW w:w="4920" w:type="dxa"/>
+          </w:tcPr>
+          <w:p>
+            <w:pPr/>
+            <w:r>
+              <w:t xml:space="preserve">"New badge!" note when a badge reaches a new level</w:t>
+            </w:r>
+          </w:p>
+        </w:tc>
+        <w:tc>
+          <w:tcPr>
+            <w:tcW w:w="4440" w:type="dxa"/>
+          </w:tcPr>
+          <w:p>
+            <w:pPr/>
+            <w:r>
+              <w:t xml:space="preserve">Pops up at the top of any page; See badges → Stats → Badges</w:t>
+            </w:r>
+          </w:p>
+        </w:tc>
+      </w:tr>
+      <w:tr>
+        <w:tc>
+          <w:tcPr>
+            <w:tcW w:w="4920" w:type="dxa"/>
+          </w:tcPr>
+          <w:p>
+            <w:pPr/>
+            <w:r>
+              <w:t xml:space="preserve">Critic and audience scores (IMDb, Rotten Tomatoes, Metacritic, TMDB); Highest rated sort</w:t>
+            </w:r>
+          </w:p>
+        </w:tc>
+        <w:tc>
+          <w:tcPr>
+            <w:tcW w:w="4440" w:type="dxa"/>
+          </w:tcPr>
+          <w:p>
+            <w:pPr/>
+            <w:r>
+              <w:t xml:space="preserve">Show page and movie sheet → Scores; Watchlist → Queue</w:t>
+            </w:r>
+          </w:p>
+        </w:tc>
+      </w:tr>
+      <w:tr>
+        <w:tc>
+          <w:tcPr>
+            <w:tcW w:w="4920" w:type="dxa"/>
           </w:tcPr>
           <w:p>
             <w:pPr/>
@@ -527,7 +565,7 @@
         </w:tc>
         <w:tc>
           <w:tcPr>
-            <w:tcW w:w="4355" w:type="dxa"/>
+            <w:tcW w:w="4440" w:type="dxa"/>
           </w:tcPr>
           <w:p>
             <w:pPr/>
@@ -540,7 +578,7 @@
       <w:tr>
         <w:tc>
           <w:tcPr>
-            <w:tcW w:w="5004" w:type="dxa"/>
+            <w:tcW w:w="4920" w:type="dxa"/>
           </w:tcPr>
           <w:p>
             <w:pPr/>
@@ -551,7 +589,7 @@
         </w:tc>
         <w:tc>
           <w:tcPr>
-            <w:tcW w:w="4355" w:type="dxa"/>
+            <w:tcW w:w="4440" w:type="dxa"/>
           </w:tcPr>
           <w:p>
             <w:pPr/>
@@ -564,7 +602,7 @@
       <w:tr>
         <w:tc>
           <w:tcPr>
-            <w:tcW w:w="5004" w:type="dxa"/>
+            <w:tcW w:w="4920" w:type="dxa"/>
           </w:tcPr>
           <w:p>
             <w:pPr/>
@@ -575,7 +613,7 @@
         </w:tc>
         <w:tc>
           <w:tcPr>
-            <w:tcW w:w="4355" w:type="dxa"/>
+            <w:tcW w:w="4440" w:type="dxa"/>
           </w:tcPr>
           <w:p>
             <w:pPr/>
@@ -588,7 +626,7 @@
       <w:tr>
         <w:tc>
           <w:tcPr>
-            <w:tcW w:w="5004" w:type="dxa"/>
+            <w:tcW w:w="4920" w:type="dxa"/>
           </w:tcPr>
           <w:p>
             <w:pPr/>
@@ -599,7 +637,7 @@
         </w:tc>
         <w:tc>
           <w:tcPr>
-            <w:tcW w:w="4355" w:type="dxa"/>
+            <w:tcW w:w="4440" w:type="dxa"/>
           </w:tcPr>
           <w:p>
             <w:pPr/>
@@ -612,7 +650,7 @@
       <w:tr>
         <w:tc>
           <w:tcPr>
-            <w:tcW w:w="5004" w:type="dxa"/>
+            <w:tcW w:w="4920" w:type="dxa"/>
           </w:tcPr>
           <w:p>
             <w:pPr/>
@@ -623,7 +661,7 @@
         </w:tc>
         <w:tc>
           <w:tcPr>
-            <w:tcW w:w="4355" w:type="dxa"/>
+            <w:tcW w:w="4440" w:type="dxa"/>
           </w:tcPr>
           <w:p>
             <w:pPr/>
@@ -636,7 +674,7 @@
       <w:tr>
         <w:tc>
           <w:tcPr>
-            <w:tcW w:w="5004" w:type="dxa"/>
+            <w:tcW w:w="4920" w:type="dxa"/>
           </w:tcPr>
           <w:p>
             <w:pPr/>
@@ -647,7 +685,7 @@
         </w:tc>
         <w:tc>
           <w:tcPr>
-            <w:tcW w:w="4355" w:type="dxa"/>
+            <w:tcW w:w="4440" w:type="dxa"/>
           </w:tcPr>
           <w:p>
             <w:pPr/>
@@ -660,7 +698,7 @@
       <w:tr>
         <w:tc>
           <w:tcPr>
-            <w:tcW w:w="5004" w:type="dxa"/>
+            <w:tcW w:w="4920" w:type="dxa"/>
           </w:tcPr>
           <w:p>
             <w:pPr/>
@@ -671,7 +709,7 @@
         </w:tc>
         <w:tc>
           <w:tcPr>
-            <w:tcW w:w="4355" w:type="dxa"/>
+            <w:tcW w:w="4440" w:type="dxa"/>
           </w:tcPr>
           <w:p>
             <w:pPr/>
@@ -684,7 +722,7 @@
       <w:tr>
         <w:tc>
           <w:tcPr>
-            <w:tcW w:w="5004" w:type="dxa"/>
+            <w:tcW w:w="4920" w:type="dxa"/>
           </w:tcPr>
           <w:p>
             <w:pPr/>
@@ -695,7 +733,7 @@
         </w:tc>
         <w:tc>
           <w:tcPr>
-            <w:tcW w:w="4355" w:type="dxa"/>
+            <w:tcW w:w="4440" w:type="dxa"/>
           </w:tcPr>
           <w:p>
             <w:pPr/>
@@ -708,7 +746,7 @@
       <w:tr>
         <w:tc>
           <w:tcPr>
-            <w:tcW w:w="5004" w:type="dxa"/>
+            <w:tcW w:w="4920" w:type="dxa"/>
           </w:tcPr>
           <w:p>
             <w:pPr/>
@@ -719,7 +757,7 @@
         </w:tc>
         <w:tc>
           <w:tcPr>
-            <w:tcW w:w="4355" w:type="dxa"/>
+            <w:tcW w:w="4440" w:type="dxa"/>
           </w:tcPr>
           <w:p>
             <w:pPr/>
@@ -732,7 +770,7 @@
       <w:tr>
         <w:tc>
           <w:tcPr>
-            <w:tcW w:w="5004" w:type="dxa"/>
+            <w:tcW w:w="4920" w:type="dxa"/>
           </w:tcPr>
           <w:p>
             <w:pPr/>
@@ -743,7 +781,7 @@
         </w:tc>
         <w:tc>
           <w:tcPr>
-            <w:tcW w:w="4355" w:type="dxa"/>
+            <w:tcW w:w="4440" w:type="dxa"/>
           </w:tcPr>
           <w:p>
             <w:pPr/>
@@ -756,7 +794,7 @@
       <w:tr>
         <w:tc>
           <w:tcPr>
-            <w:tcW w:w="5004" w:type="dxa"/>
+            <w:tcW w:w="4920" w:type="dxa"/>
           </w:tcPr>
           <w:p>
             <w:pPr/>
@@ -767,7 +805,7 @@
         </w:tc>
         <w:tc>
           <w:tcPr>
-            <w:tcW w:w="4355" w:type="dxa"/>
+            <w:tcW w:w="4440" w:type="dxa"/>
           </w:tcPr>
           <w:p>
             <w:pPr/>
@@ -780,7 +818,7 @@
       <w:tr>
         <w:tc>
           <w:tcPr>
-            <w:tcW w:w="5004" w:type="dxa"/>
+            <w:tcW w:w="4920" w:type="dxa"/>
           </w:tcPr>
           <w:p>
             <w:pPr/>
@@ -791,7 +829,7 @@
         </w:tc>
         <w:tc>
           <w:tcPr>
-            <w:tcW w:w="4355" w:type="dxa"/>
+            <w:tcW w:w="4440" w:type="dxa"/>
           </w:tcPr>
           <w:p>
             <w:pPr/>
@@ -804,7 +842,7 @@
       <w:tr>
         <w:tc>
           <w:tcPr>
-            <w:tcW w:w="5004" w:type="dxa"/>
+            <w:tcW w:w="4920" w:type="dxa"/>
           </w:tcPr>
           <w:p>
             <w:pPr/>
@@ -815,7 +853,7 @@
         </w:tc>
         <w:tc>
           <w:tcPr>
-            <w:tcW w:w="4355" w:type="dxa"/>
+            <w:tcW w:w="4440" w:type="dxa"/>
           </w:tcPr>
           <w:p>
             <w:pPr/>
@@ -828,7 +866,7 @@
       <w:tr>
         <w:tc>
           <w:tcPr>
-            <w:tcW w:w="5004" w:type="dxa"/>
+            <w:tcW w:w="4920" w:type="dxa"/>
           </w:tcPr>
           <w:p>
             <w:pPr/>
@@ -839,7 +877,7 @@
         </w:tc>
         <w:tc>
           <w:tcPr>
-            <w:tcW w:w="4355" w:type="dxa"/>
+            <w:tcW w:w="4440" w:type="dxa"/>
           </w:tcPr>
           <w:p>
             <w:pPr/>

</xml_diff>